<commit_message>
spec(ops): add L10 cadence + mark NDA signed in Aman kickoff
Leadership L10 Wed 8 AM CST and all-team L10 Thursday added to weekly rhythm,
block 3, and the follow-up message. NDA line changed from 'you will sign' to
'already signed.'

Co-Authored-By: Claude Opus 4.8 <noreply@anthropic.com>
</commit_message>
<xml_diff>
--- a/docs/superpowers/handoff/aman-internship/Aman_Internship_Kickoff_Package.docx
+++ b/docs/superpowers/handoff/aman-internship/Aman_Internship_Kickoff_Package.docx
@@ -918,7 +918,7 @@
           <w:sz w:val="20"/>
           <w:szCs w:val="20"/>
         </w:rPr>
-        <w:t xml:space="preserve">“One thing up front: we are pointing at selling the business in a couple of years, so a lot of your work is making us organized and documented. That stays between us, you will sign an NDA, and it is research and drafting only. You never contact anyone outside the company without me.”</w:t>
+        <w:t xml:space="preserve">“One thing up front: we are pointing at selling the business in a couple of years, so a lot of your work is making us organized and documented. That stays between us. You already signed the NDA, so we are set there. It is research and drafting only, and you never contact anyone outside the company without me.”</w:t>
       </w:r>
     </w:p>
     <w:p>
@@ -1134,6 +1134,44 @@
           <w:szCs w:val="20"/>
         </w:rPr>
         <w:t xml:space="preserve">, 30 minutes.”</w:t>
+      </w:r>
+    </w:p>
+    <w:p>
+      <w:pPr>
+        <w:pBdr>
+          <w:left w:val="single" w:color="F2B705" w:sz="12" w:space="8"/>
+        </w:pBdr>
+        <w:spacing w:after="100"/>
+        <w:ind w:left="360"/>
+      </w:pPr>
+      <w:r>
+        <w:rPr>
+          <w:rFonts w:ascii="Arial" w:cs="Arial" w:eastAsia="Arial" w:hAnsi="Arial"/>
+          <w:color w:val="1A2B4E"/>
+          <w:sz w:val="20"/>
+          <w:szCs w:val="20"/>
+        </w:rPr>
+        <w:t xml:space="preserve">“Two standing meetings to put on your calendar. Leadership L10 is Wednesdays at 8 AM Central, that is you and the leadership team. The all-team L10 is Thursdays </w:t>
+      </w:r>
+      <w:r>
+        <w:rPr>
+          <w:rFonts w:ascii="Arial" w:cs="Arial" w:eastAsia="Arial" w:hAnsi="Arial"/>
+          <w:b/>
+          <w:bCs/>
+          <w:color w:val="F2B705"/>
+          <w:sz w:val="20"/>
+          <w:szCs w:val="20"/>
+        </w:rPr>
+        <w:t xml:space="preserve">[time]</w:t>
+      </w:r>
+      <w:r>
+        <w:rPr>
+          <w:rFonts w:ascii="Arial" w:cs="Arial" w:eastAsia="Arial" w:hAnsi="Arial"/>
+          <w:color w:val="1A2B4E"/>
+          <w:sz w:val="20"/>
+          <w:szCs w:val="20"/>
+        </w:rPr>
+        <w:t xml:space="preserve"> Central. Plan to join both.”</w:t>
       </w:r>
     </w:p>
     <w:p>
@@ -1819,6 +1857,32 @@
       </w:pPr>
       <w:r>
         <w:t xml:space="preserve">About 20 hours a week, on your own schedule. Send Daniel your rough working days each week.</w:t>
+      </w:r>
+    </w:p>
+    <w:p>
+      <w:pPr>
+        <w:pStyle w:val="ListParagraph"/>
+        <w:numPr>
+          <w:ilvl w:val="0"/>
+          <w:numId w:val="3"/>
+        </w:numPr>
+        <w:spacing w:after="60"/>
+      </w:pPr>
+      <w:r>
+        <w:t xml:space="preserve">Leadership L10: Wednesdays, 8:00 AM Central. You and the leadership team. Standing meeting.</w:t>
+      </w:r>
+    </w:p>
+    <w:p>
+      <w:pPr>
+        <w:pStyle w:val="ListParagraph"/>
+        <w:numPr>
+          <w:ilvl w:val="0"/>
+          <w:numId w:val="3"/>
+        </w:numPr>
+        <w:spacing w:after="60"/>
+      </w:pPr>
+      <w:r>
+        <w:t xml:space="preserve">All-team L10: Thursdays, [time] Central. The whole team. Plan to join.</w:t>
       </w:r>
     </w:p>
     <w:p>
@@ -3190,7 +3254,22 @@
                 <w:sz w:val="22"/>
                 <w:szCs w:val="22"/>
               </w:rPr>
-              <w:t xml:space="preserve">Our weekly 1:1 is [day/time]. Day to day, reach me by text or email anytime. Reply with your plan for week one by [date]. Looking forward to it.</w:t>
+              <w:t xml:space="preserve">Standing meetings to add to your calendar: Leadership L10 Wednesdays at 8 AM Central, and the all-team L10 Thursdays at [time] Central. Plan to join both. Our weekly 1:1 is [day/time]. Day to day, reach me by text or email anytime.</w:t>
+            </w:r>
+          </w:p>
+          <w:p>
+            <w:pPr>
+              <w:spacing w:after="120"/>
+            </w:pPr>
+            <w:r>
+              <w:rPr>
+                <w:i/>
+                <w:iCs/>
+                <w:color w:val="1A2B4E"/>
+                <w:sz w:val="22"/>
+                <w:szCs w:val="22"/>
+              </w:rPr>
+              <w:t xml:space="preserve">Reply with your plan for week one by [date]. Looking forward to it.</w:t>
             </w:r>
           </w:p>
           <w:p>

</xml_diff>